<commit_message>
Bring the resume onto the Human-Centred convention
The site standardized on "Human-Centred" but the resume still spelled it
unhyphenated in three places: a core competency, a technical skill and the
SAIT focus line. Now consistent with the site, hcai.html and the SIGNAL
entry in the career profile.

The PDF is re-exported and was checked to carry the hyphenated spelling with
no unhyphenated or americanised form left anywhere in its text, so the file
the site actually links matches the document it came from.

Also ignore .vs/, Visual Studio's local metadata directory, alongside the
.vscode/ and .idea/ entries already there.

Co-Authored-By: Claude Opus 5 <noreply@anthropic.com>
Claude-Session: https://claude.ai/code/session_015j3buxfwt3G3BtrvVD8Mmv
</commit_message>
<xml_diff>
--- a/documents/Resume_Roy_Aggarwal_Fall_2026.docx
+++ b/documents/Resume_Roy_Aggarwal_Fall_2026.docx
@@ -181,7 +181,7 @@
         <w:spacing w:after="120"/>
       </w:pPr>
       <w:r>
-        <w:t>AI Strategy &amp; Governance | Ethical AI Implementation | Human Centred AI Design</w:t>
+        <w:t>AI Strategy &amp; Governance | Ethical AI Implementation | Human-Centred AI Design</w:t>
       </w:r>
     </w:p>
     <w:p>
@@ -1024,7 +1024,7 @@
         <w:ind w:left="714" w:hanging="357"/>
       </w:pPr>
       <w:r>
-        <w:t>AI &amp; Machine Learning: Applied AI Adoption &amp; Enablement, Ethical AI Frameworks, Human Centred AI Design, AI Governance Methodologies, Predictive Analytics, NLP, Computer Vision</w:t>
+        <w:t>AI &amp; Machine Learning: Applied AI Adoption &amp; Enablement, Ethical AI Frameworks, Human-Centred AI Design, AI Governance Methodologies, Predictive Analytics, NLP, Computer Vision</w:t>
       </w:r>
     </w:p>
     <w:p>
@@ -1178,7 +1178,7 @@
         </w:numPr>
       </w:pPr>
       <w:r>
-        <w:t>Focus: Applied AI Management &amp; Operations, Ethical AI System Design, AI Governance, Human Centred AI Design</w:t>
+        <w:t>Focus: Applied AI Management &amp; Operations, Ethical AI System Design, AI Governance, Human-Centred AI Design</w:t>
       </w:r>
     </w:p>
     <w:p>

</xml_diff>

<commit_message>
Add an honours footnote to the resume education section
Adding (Honours) to each of the four education entries would flatten
the hierarchy that currently keeps the eye on the SAIT AI credential,
which is the only entry carrying a graduation year, a GPA and a focus
line. One subordinate line below the block makes the same point as a
pattern instead of four competing claims.

Set in the existing Company Info style at 10pt against the 11pt body,
with the section's trailing spacing moved off the last entry and onto
the new line so the block closes as it did before.

The PDF still needs re-exporting from Word.

Co-Authored-By: Claude Opus 5 <noreply@anthropic.com>
</commit_message>
<xml_diff>
--- a/documents/Resume_Roy_Aggarwal_Fall_2026.docx
+++ b/documents/Resume_Roy_Aggarwal_Fall_2026.docx
@@ -1115,7 +1115,6 @@
     <w:p>
       <w:pPr>
         <w:pStyle w:val="CompanyInfo"/>
-        <w:spacing w:after="240"/>
       </w:pPr>
       <w:r>
         <w:t>Southern Alberta Institute of Technology (SAIT)</w:t>
@@ -1125,6 +1124,21 @@
       </w:r>
       <w:r>
         <w:t>| Calgary, AB</w:t>
+      </w:r>
+    </w:p>
+    <w:p>
+      <w:pPr>
+        <w:pStyle w:val="CompanyInfo"/>
+        <w:spacing w:before="80" w:after="240"/>
+      </w:pPr>
+      <w:r>
+        <w:rPr>
+          <w:i/>
+          <w:iCs/>
+          <w:sz w:val="20"/>
+          <w:szCs w:val="20"/>
+        </w:rPr>
+        <w:t>Graduated with honours standing in all programs.</w:t>
       </w:r>
     </w:p>
     <w:sectPr>

</xml_diff>